<commit_message>
update api docs skill
</commit_message>
<xml_diff>
--- a/.claude/skills/documenting/scripts/reference.docx
+++ b/.claude/skills/documenting/scripts/reference.docx
@@ -355,7 +355,7 @@
       <w:rFonts w:asciiTheme="majorHAnsi" w:eastAsiaTheme="majorEastAsia" w:hAnsiTheme="majorHAnsi" w:cstheme="majorBidi"/>
       <w:b/>
       <w:bCs/>
-      <w:color w:val="345A8A" w:themeColor="accent1" w:themeShade="B5"/>
+      <w:color w:val="6BBF00"/>
       <w:sz w:val="36"/>
       <w:szCs w:val="36"/>
     </w:rPr>
@@ -411,8 +411,7 @@
       <w:sz w:val="20"/>
       <w:szCs w:val="20"/>
       <w:b/>
-      <w:color w:val="345A8A"/>
-      &gt;
+      <w:color w:val="6BBF00"/>
     </w:rPr>
   </w:style>
   <w:style w:type="paragraph" w:customStyle="1" w:styleId="Abstract">
@@ -499,7 +498,7 @@
       <w:rFonts w:ascii="Calibri Light" w:hAnsi="Calibri Light" w:cs="Calibri Light"/>
       <w:b/>
       <w:bCs/>
-      <w:color w:val="333333"/>
+      <w:color w:val="6BBF00"/>
       <w:sz w:val="24"/>
       <w:szCs w:val="24"/>
     </w:rPr>
@@ -521,7 +520,7 @@
       <w:rFonts w:asciiTheme="majorHAnsi" w:eastAsiaTheme="majorEastAsia" w:hAnsiTheme="majorHAnsi" w:cstheme="majorBidi"/>
       <w:i/>
       <w:bCs/>
-      <w:color w:val="4F81BD" w:themeColor="accent1"/>
+      <w:color w:val="6BBF00"/>
       <w:sz w:val="24"/>
       <w:szCs w:val="24"/>
     </w:rPr>
@@ -542,7 +541,7 @@
     <w:rPr>
       <w:rFonts w:asciiTheme="majorHAnsi" w:eastAsiaTheme="majorEastAsia" w:hAnsiTheme="majorHAnsi" w:cstheme="majorBidi"/>
       <w:iCs/>
-      <w:color w:val="4F81BD" w:themeColor="accent1"/>
+      <w:color w:val="6BBF00"/>
       <w:sz w:val="24"/>
       <w:szCs w:val="24"/>
     </w:rPr>
@@ -557,9 +556,6 @@
       <w:keepNext/>
       <w:spacing w:before="200" w:after="0" w:line="240" w:lineRule="auto"/>
       <w:outlineLvl w:val="5"/>
-    </w:pPr>
-    <w:pPr>
-      <w:spacing w:before="200" w:after="0" w:line="240" w:lineRule="auto"/>
     </w:pPr>
     <w:rPr>
       <w:rFonts w:ascii="Calibri" w:hAnsi="Calibri" w:cs="Calibri"/>
@@ -585,7 +581,7 @@
     </w:pPr>
     <w:rPr>
       <w:rFonts w:asciiTheme="majorHAnsi" w:eastAsiaTheme="majorEastAsia" w:hAnsiTheme="majorHAnsi" w:cstheme="majorBidi"/>
-      <w:color w:val="4F81BD" w:themeColor="accent1"/>
+      <w:color w:val="6BBF00"/>
       <w:sz w:val="24"/>
       <w:szCs w:val="24"/>
     </w:rPr>
@@ -605,7 +601,7 @@
     </w:pPr>
     <w:rPr>
       <w:rFonts w:asciiTheme="majorHAnsi" w:eastAsiaTheme="majorEastAsia" w:hAnsiTheme="majorHAnsi" w:cstheme="majorBidi"/>
-      <w:color w:val="4F81BD" w:themeColor="accent1"/>
+      <w:color w:val="6BBF00"/>
       <w:sz w:val="24"/>
       <w:szCs w:val="24"/>
     </w:rPr>
@@ -625,7 +621,7 @@
     </w:pPr>
     <w:rPr>
       <w:rFonts w:asciiTheme="majorHAnsi" w:eastAsiaTheme="majorEastAsia" w:hAnsiTheme="majorHAnsi" w:cstheme="majorBidi"/>
-      <w:color w:val="4F81BD" w:themeColor="accent1"/>
+      <w:color w:val="6BBF00"/>
       <w:sz w:val="24"/>
       <w:szCs w:val="24"/>
     </w:rPr>
@@ -771,10 +767,11 @@
     <w:name w:val="Verbatim Char"/>
     <w:basedOn w:val="BodyTextChar"/>
     <w:rPr>
-      <w:rFonts w:ascii="Courier New" w:hAnsi="Courier New" w:cs="Courier New"/>
+      <w:rFonts w:ascii="Cascadia Code" w:hAnsi="Cascadia Code" w:cs="Cascadia Code"/>
       <w:color w:val="333333"/>
       <w:sz w:val="20"/>
       <w:szCs w:val="20"/>
+      <w:shd w:val="clear" w:color="auto" w:fill="E4F1CC"/>
     </w:rPr>
   </w:style>
   <w:style w:type="character" w:customStyle="1" w:styleId="SectionNumber">
@@ -811,7 +808,7 @@
       <w:rFonts w:asciiTheme="majorHAnsi" w:eastAsiaTheme="majorEastAsia" w:hAnsiTheme="majorHAnsi" w:cstheme="majorBidi"/>
       <w:b w:val="0"/>
       <w:bCs w:val="0"/>
-      <w:color w:val="365F91" w:themeColor="accent1" w:themeShade="BF"/>
+      <w:color w:val="6BBF00"/>
     </w:rPr>
   </w:style>
   <w:style w:type="paragraph" w:customStyle="1" w:styleId="SourceCode">
@@ -828,7 +825,7 @@
       <w:spacing w:before="200" w:after="200" w:line="320" w:lineRule="auto"/>
     </w:pPr>
     <w:rPr>
-      <w:rFonts w:ascii="Courier New" w:hAnsi="Courier New" w:cs="Courier New"/>
+      <w:rFonts w:ascii="Cascadia Code" w:hAnsi="Cascadia Code" w:cs="Cascadia Code"/>
       <w:color w:val="333333"/>
       <w:sz w:val="22"/>
       <w:szCs w:val="22"/>
@@ -839,13 +836,16 @@
     <w:basedOn w:val="VerbatimChar"/>
     <w:rPr>
       <w:color w:val="6BBF00"/>
+      <w:shd w:val="clear" w:color="auto" w:fill="auto"/>
     </w:rPr>
   </w:style>
   <w:style w:type="character" w:customStyle="1" w:styleId="KeywordTok">
     <w:name w:val="KeywordTok"/>
     <w:basedOn w:val="VerbatimChar"/>
     <w:rPr>
-      <w:color w:val="333333"/>
+      <w:color w:val="0033B3"/>
+      <w:b/>
+      <w:shd w:val="clear" w:color="auto" w:fill="auto"/>
     </w:rPr>
   </w:style>
   <w:style w:type="character" w:customStyle="1" w:styleId="NormalTok">
@@ -853,6 +853,7 @@
     <w:basedOn w:val="VerbatimChar"/>
     <w:rPr>
       <w:color w:val="333333"/>
+      <w:shd w:val="clear" w:color="auto" w:fill="auto"/>
     </w:rPr>
   </w:style>
   <w:style w:type="character" w:customStyle="1" w:styleId="OperatorTok">
@@ -860,27 +861,31 @@
     <w:basedOn w:val="VerbatimChar"/>
     <w:rPr>
       <w:color w:val="333333"/>
+      <w:shd w:val="clear" w:color="auto" w:fill="auto"/>
     </w:rPr>
   </w:style>
   <w:style w:type="character" w:customStyle="1" w:styleId="DecValTok">
     <w:name w:val="DecValTok"/>
     <w:basedOn w:val="VerbatimChar"/>
     <w:rPr>
-      <w:color w:val="333333"/>
+      <w:color w:val="098658"/>
+      <w:shd w:val="clear" w:color="auto" w:fill="auto"/>
     </w:rPr>
   </w:style>
   <w:style w:type="character" w:customStyle="1" w:styleId="StringTok">
     <w:name w:val="StringTok"/>
     <w:basedOn w:val="VerbatimChar"/>
     <w:rPr>
-      <w:color w:val="333333"/>
+      <w:color w:val="067D17"/>
+      <w:shd w:val="clear" w:color="auto" w:fill="auto"/>
     </w:rPr>
   </w:style>
   <w:style w:type="character" w:customStyle="1" w:styleId="FunctionTok">
     <w:name w:val="FunctionTok"/>
     <w:basedOn w:val="VerbatimChar"/>
     <w:rPr>
-      <w:color w:val="333333"/>
+      <w:color w:val="7A3E9D"/>
+      <w:shd w:val="clear" w:color="auto" w:fill="auto"/>
     </w:rPr>
   </w:style>
   <w:style w:type="character" w:customStyle="1" w:styleId="OtherTok">
@@ -888,6 +893,198 @@
     <w:basedOn w:val="VerbatimChar"/>
     <w:rPr>
       <w:color w:val="333333"/>
+      <w:shd w:val="clear" w:color="auto" w:fill="auto"/>
+    </w:rPr>
+  </w:style>
+  <w:style w:type="character" w:customStyle="1" w:styleId="DataTypeTok">
+    <w:name w:val="DataTypeTok"/>
+    <w:basedOn w:val="VerbatimChar"/>
+    <w:rPr>
+      <w:color w:val="0F6E56"/>
+      <w:shd w:val="clear" w:color="auto" w:fill="auto"/>
+    </w:rPr>
+  </w:style>
+  <w:style w:type="character" w:customStyle="1" w:styleId="BuiltInTok">
+    <w:name w:val="BuiltInTok"/>
+    <w:basedOn w:val="VerbatimChar"/>
+    <w:rPr>
+      <w:color w:val="0F6E56"/>
+      <w:shd w:val="clear" w:color="auto" w:fill="auto"/>
+    </w:rPr>
+  </w:style>
+  <w:style w:type="character" w:customStyle="1" w:styleId="ControlFlowTok">
+    <w:name w:val="ControlFlowTok"/>
+    <w:basedOn w:val="VerbatimChar"/>
+    <w:rPr>
+      <w:color w:val="0033B3"/>
+      <w:b/>
+      <w:shd w:val="clear" w:color="auto" w:fill="auto"/>
+    </w:rPr>
+  </w:style>
+  <w:style w:type="character" w:customStyle="1" w:styleId="ImportTok">
+    <w:name w:val="ImportTok"/>
+    <w:basedOn w:val="VerbatimChar"/>
+    <w:rPr>
+      <w:color w:val="0033B3"/>
+      <w:shd w:val="clear" w:color="auto" w:fill="auto"/>
+    </w:rPr>
+  </w:style>
+  <w:style w:type="character" w:customStyle="1" w:styleId="InformationTok">
+    <w:name w:val="InformationTok"/>
+    <w:basedOn w:val="VerbatimChar"/>
+    <w:rPr>
+      <w:color w:val="0033B3"/>
+      <w:shd w:val="clear" w:color="auto" w:fill="auto"/>
+    </w:rPr>
+  </w:style>
+  <w:style w:type="character" w:customStyle="1" w:styleId="PreprocessorTok">
+    <w:name w:val="PreprocessorTok"/>
+    <w:basedOn w:val="VerbatimChar"/>
+    <w:rPr>
+      <w:color w:val="0033B3"/>
+      <w:shd w:val="clear" w:color="auto" w:fill="auto"/>
+    </w:rPr>
+  </w:style>
+  <w:style w:type="character" w:customStyle="1" w:styleId="ConstantTok">
+    <w:name w:val="ConstantTok"/>
+    <w:basedOn w:val="VerbatimChar"/>
+    <w:rPr>
+      <w:color w:val="098658"/>
+      <w:shd w:val="clear" w:color="auto" w:fill="auto"/>
+    </w:rPr>
+  </w:style>
+  <w:style w:type="character" w:customStyle="1" w:styleId="BaseNTok">
+    <w:name w:val="BaseNTok"/>
+    <w:basedOn w:val="VerbatimChar"/>
+    <w:rPr>
+      <w:color w:val="098658"/>
+      <w:shd w:val="clear" w:color="auto" w:fill="auto"/>
+    </w:rPr>
+  </w:style>
+  <w:style w:type="character" w:customStyle="1" w:styleId="FloatTok">
+    <w:name w:val="FloatTok"/>
+    <w:basedOn w:val="VerbatimChar"/>
+    <w:rPr>
+      <w:color w:val="098658"/>
+      <w:shd w:val="clear" w:color="auto" w:fill="auto"/>
+    </w:rPr>
+  </w:style>
+  <w:style w:type="character" w:customStyle="1" w:styleId="CharTok">
+    <w:name w:val="CharTok"/>
+    <w:basedOn w:val="VerbatimChar"/>
+    <w:rPr>
+      <w:color w:val="067D17"/>
+      <w:shd w:val="clear" w:color="auto" w:fill="auto"/>
+    </w:rPr>
+  </w:style>
+  <w:style w:type="character" w:customStyle="1" w:styleId="SpecialCharTok">
+    <w:name w:val="SpecialCharTok"/>
+    <w:basedOn w:val="VerbatimChar"/>
+    <w:rPr>
+      <w:color w:val="067D17"/>
+      <w:shd w:val="clear" w:color="auto" w:fill="auto"/>
+    </w:rPr>
+  </w:style>
+  <w:style w:type="character" w:customStyle="1" w:styleId="VerbatimStringTok">
+    <w:name w:val="VerbatimStringTok"/>
+    <w:basedOn w:val="VerbatimChar"/>
+    <w:rPr>
+      <w:color w:val="067D17"/>
+      <w:shd w:val="clear" w:color="auto" w:fill="auto"/>
+    </w:rPr>
+  </w:style>
+  <w:style w:type="character" w:customStyle="1" w:styleId="SpecialStringTok">
+    <w:name w:val="SpecialStringTok"/>
+    <w:basedOn w:val="VerbatimChar"/>
+    <w:rPr>
+      <w:color w:val="067D17"/>
+      <w:shd w:val="clear" w:color="auto" w:fill="auto"/>
+    </w:rPr>
+  </w:style>
+  <w:style w:type="character" w:customStyle="1" w:styleId="AttributeTok">
+    <w:name w:val="AttributeTok"/>
+    <w:basedOn w:val="VerbatimChar"/>
+    <w:rPr>
+      <w:color w:val="7A3E9D"/>
+      <w:shd w:val="clear" w:color="auto" w:fill="auto"/>
+    </w:rPr>
+  </w:style>
+  <w:style w:type="character" w:customStyle="1" w:styleId="VariableTok">
+    <w:name w:val="VariableTok"/>
+    <w:basedOn w:val="VerbatimChar"/>
+    <w:rPr>
+      <w:color w:val="333333"/>
+      <w:shd w:val="clear" w:color="auto" w:fill="auto"/>
+    </w:rPr>
+  </w:style>
+  <w:style w:type="character" w:customStyle="1" w:styleId="ExtensionTok">
+    <w:name w:val="ExtensionTok"/>
+    <w:basedOn w:val="VerbatimChar"/>
+    <w:rPr>
+      <w:color w:val="333333"/>
+      <w:shd w:val="clear" w:color="auto" w:fill="auto"/>
+    </w:rPr>
+  </w:style>
+  <w:style w:type="character" w:customStyle="1" w:styleId="RegionMarkerTok">
+    <w:name w:val="RegionMarkerTok"/>
+    <w:basedOn w:val="VerbatimChar"/>
+    <w:rPr>
+      <w:color w:val="333333"/>
+      <w:shd w:val="clear" w:color="auto" w:fill="auto"/>
+    </w:rPr>
+  </w:style>
+  <w:style w:type="character" w:customStyle="1" w:styleId="DocumentationTok">
+    <w:name w:val="DocumentationTok"/>
+    <w:basedOn w:val="VerbatimChar"/>
+    <w:rPr>
+      <w:color w:val="6BBF00"/>
+      <w:i/>
+      <w:shd w:val="clear" w:color="auto" w:fill="auto"/>
+    </w:rPr>
+  </w:style>
+  <w:style w:type="character" w:customStyle="1" w:styleId="AnnotationTok">
+    <w:name w:val="AnnotationTok"/>
+    <w:basedOn w:val="VerbatimChar"/>
+    <w:rPr>
+      <w:color w:val="6BBF00"/>
+      <w:i/>
+      <w:shd w:val="clear" w:color="auto" w:fill="auto"/>
+    </w:rPr>
+  </w:style>
+  <w:style w:type="character" w:customStyle="1" w:styleId="CommentVarTok">
+    <w:name w:val="CommentVarTok"/>
+    <w:basedOn w:val="VerbatimChar"/>
+    <w:rPr>
+      <w:color w:val="6BBF00"/>
+      <w:i/>
+      <w:shd w:val="clear" w:color="auto" w:fill="auto"/>
+    </w:rPr>
+  </w:style>
+  <w:style w:type="character" w:customStyle="1" w:styleId="WarningTok">
+    <w:name w:val="WarningTok"/>
+    <w:basedOn w:val="VerbatimChar"/>
+    <w:rPr>
+      <w:color w:val="985E00"/>
+      <w:b/>
+      <w:shd w:val="clear" w:color="auto" w:fill="auto"/>
+    </w:rPr>
+  </w:style>
+  <w:style w:type="character" w:customStyle="1" w:styleId="AlertTok">
+    <w:name w:val="AlertTok"/>
+    <w:basedOn w:val="VerbatimChar"/>
+    <w:rPr>
+      <w:color w:val="A31515"/>
+      <w:b/>
+      <w:shd w:val="clear" w:color="auto" w:fill="auto"/>
+    </w:rPr>
+  </w:style>
+  <w:style w:type="character" w:customStyle="1" w:styleId="ErrorTok">
+    <w:name w:val="ErrorTok"/>
+    <w:basedOn w:val="VerbatimChar"/>
+    <w:rPr>
+      <w:color w:val="A31515"/>
+      <w:b/>
+      <w:shd w:val="clear" w:color="auto" w:fill="auto"/>
     </w:rPr>
   </w:style>
 </w:styles>

</xml_diff>